<commit_message>
Refresh literature survey with 2025-2026 papers across deck, report and survey table
Co-Authored-By: Claude Sonnet 5.5 <noreply@anthropic.com>
Claude-Session: https://claude.ai/code/session_01DuJtm1bHy6SxuGUPpHM4Ua
</commit_message>
<xml_diff>
--- a/zeroth_review/Literature_Survey_Table.docx
+++ b/zeroth_review/Literature_Survey_Table.docx
@@ -92,7 +92,7 @@
           <w:i w:val="0"/>
           <w:sz w:val="20"/>
         </w:rPr>
-        <w:t>The survey supports one question: what does learned token grouping in a vision transformer contribute beyond added capacity, and how should that be tested fairly? It covers seven themes: hierarchical vision transformers, token reduction, learned grouping and object-centric methods, emergent-region evaluation, causal-emergence theory (the original motivation of the minor project), evaluation rigour, and our own prior work.</w:t>
+        <w:t>The survey supports one question: what does learned token grouping in a vision transformer contribute beyond added capacity, and how should that be tested fairly? It covers 25 works in eight themes: token merging and pruning, hierarchical and adaptive tokenization, extra tokens and registers, object-centric and slot-based learning, dense features and emergent regions, evaluation rigour, causal emergence (the original motivation of the minor project), and our own prior work.</w:t>
       </w:r>
     </w:p>
     <w:p>
@@ -102,7 +102,17 @@
           <w:i w:val="0"/>
           <w:sz w:val="20"/>
         </w:rPr>
-        <w:t>Sources. The reference list of the minor-project paper (CET-ViT, IEEE ICSL-DSGA 2026), the compute-matched audit of that work, and a search of the Lacuna ML research index for the works added since (TokenLearner, PatchMerger, Registers, DINOSAUR, ImageNet-S and the evaluation-rigour papers). Title, year and venue of the added works were checked against that index; author lists and page numbers should be re-checked against the publisher record before the final report. Entries 23 and 24 are our own work; entry 24 is an unpublished draft.</w:t>
+        <w:t>Selection. All 23 external works are from 2025 or 2026 (NeurIPS 2025, ICLR 2025 and 2026, ICML 2026, CVPR 2025 and 2026, IJCAI 2025, COLM 2025, TMLR 2025, IEEE TPAMI 2025, npj Complexity 2025, and arXiv preprints). Swin and PVT are listed only as background baselines. The two causal-emergence entries come from the reference list of the minor-project paper.</w:t>
+      </w:r>
+    </w:p>
+    <w:p>
+      <w:r>
+        <w:rPr>
+          <w:b w:val="0"/>
+          <w:i w:val="0"/>
+          <w:sz w:val="20"/>
+        </w:rPr>
+        <w:t>Sources and verification. Candidate works were found through the Lacuna ML research index (searches restricted to 2025 onward) and the minor-project reference list. Title, authors, venue and year of each entry were checked against the index record. The 'Setting', 'Key findings' and 'Limitations' columns were written from abstracts and index summaries, not from full texts. The full texts of the works most central to RO2 and RO4 (entries 10 to 18) will be read before Review I, and any correction made here. Entries 24 and 25 are our own work; entry 25 is an unpublished draft.</w:t>
       </w:r>
     </w:p>
     <w:p>
@@ -241,7 +251,7 @@
                 <w:color w:val="FFFFFF"/>
                 <w:sz w:val="18"/>
               </w:rPr>
-              <w:t>Dataset / evidence</w:t>
+              <w:t>Setting (from abstract)</w:t>
             </w:r>
           </w:p>
         </w:tc>
@@ -314,7 +324,7 @@
                 <w:color w:val="0F2A3D"/>
                 <w:sz w:val="17"/>
               </w:rPr>
-              <w:t>HIERARCHICAL VITS</w:t>
+              <w:t>TOKEN MERGING AND PRUNING</w:t>
             </w:r>
           </w:p>
         </w:tc>
@@ -360,7 +370,7 @@
                 <w:color w:val="0F2A3D"/>
                 <w:sz w:val="17"/>
               </w:rPr>
-              <w:t>Dosovitskiy et al., ViT (ICLR 2021)</w:t>
+              <w:t>Lee et al., Frequency-aware token reduction (NeurIPS 2025)</w:t>
             </w:r>
           </w:p>
         </w:tc>
@@ -380,7 +390,7 @@
                 <w:i w:val="0"/>
                 <w:sz w:val="17"/>
               </w:rPr>
-              <w:t>Pure transformer on a sequence of image patches; single-resolution, non-hierarchical.</w:t>
+              <w:t>Token pruning and merging that accounts for the frequency characteristics of self-attention (for example rank collapsing) instead of attention scores alone.</w:t>
             </w:r>
           </w:p>
         </w:tc>
@@ -400,7 +410,7 @@
                 <w:i w:val="0"/>
                 <w:sz w:val="17"/>
               </w:rPr>
-              <w:t>ImageNet and larger pre-training sets.</w:t>
+              <w:t>Efficient ViT inference; token reduction.</w:t>
             </w:r>
           </w:p>
         </w:tc>
@@ -420,7 +430,7 @@
                 <w:i w:val="0"/>
                 <w:sz w:val="17"/>
               </w:rPr>
-              <w:t>Matches or exceeds CNNs when pre-trained on large data.</w:t>
+              <w:t>Argues that ignoring the frequency behaviour of attention limits existing token-reduction methods.</w:t>
             </w:r>
           </w:p>
         </w:tc>
@@ -440,7 +450,7 @@
                 <w:i w:val="0"/>
                 <w:sz w:val="17"/>
               </w:rPr>
-              <w:t>Needs large pre-training; no multi-scale structure; weak in the small-data, from-scratch regime our study targets.</w:t>
+              <w:t>Reduces tokens for efficiency on existing ViTs. It does not test whether learned grouping adds representation value beyond an equal-capacity control, nor the from-scratch small-image regime.</w:t>
             </w:r>
           </w:p>
         </w:tc>
@@ -488,7 +498,7 @@
                 <w:color w:val="0F2A3D"/>
                 <w:sz w:val="17"/>
               </w:rPr>
-              <w:t>Liu et al., Swin (ICCV 2021)</w:t>
+              <w:t>Xie et al., Saliency-driven token merging (CVPR 2026)</w:t>
             </w:r>
           </w:p>
         </w:tc>
@@ -509,7 +519,7 @@
                 <w:i w:val="0"/>
                 <w:sz w:val="17"/>
               </w:rPr>
-              <w:t>Shifted-window attention plus patch merging gives a fixed, position-based hierarchy.</w:t>
+              <w:t>Training-free merging that combines dynamic attention scores with offline visual saliency, merging 'saliency outlier' tokens.</w:t>
             </w:r>
           </w:p>
         </w:tc>
@@ -530,7 +540,7 @@
                 <w:i w:val="0"/>
                 <w:sz w:val="17"/>
               </w:rPr>
-              <w:t>ImageNet classification, COCO, ADE20K.</w:t>
+              <w:t>Inference acceleration of ViTs.</w:t>
             </w:r>
           </w:p>
         </w:tc>
@@ -551,7 +561,7 @@
                 <w:i w:val="0"/>
                 <w:sz w:val="17"/>
               </w:rPr>
-              <w:t>Strong accuracy-efficiency trade-off; de-facto hierarchical backbone.</w:t>
+              <w:t>Claims better merging decisions than methods that use attention characteristics alone.</w:t>
             </w:r>
           </w:p>
         </w:tc>
@@ -572,7 +582,7 @@
                 <w:i w:val="0"/>
                 <w:sz w:val="17"/>
               </w:rPr>
-              <w:t>Hierarchy is hand-designed and identical for every image. In our compute-matched audit a Swin sized to the branch's MACs scored above the branch at the locked learning rate.</w:t>
+              <w:t>Training-free and inference-time: nothing is learned about grouping, so it says nothing about grouping as a trained representation component.</w:t>
             </w:r>
           </w:p>
         </w:tc>
@@ -618,7 +628,7 @@
                 <w:color w:val="0F2A3D"/>
                 <w:sz w:val="17"/>
               </w:rPr>
-              <w:t>Wang et al., PVT (ICCV 2021)</w:t>
+              <w:t>Zhou et al., Calibrated scaling for token merging (ICML 2026)</w:t>
             </w:r>
           </w:p>
         </w:tc>
@@ -638,7 +648,7 @@
                 <w:i w:val="0"/>
                 <w:sz w:val="17"/>
               </w:rPr>
-              <w:t>Convolution-free pyramid with progressively shrinking token grids and spatial-reduction attention.</w:t>
+              <w:t>Shows that merging distorts attention outputs and shifts residual-stream statistics, and proposes statistically calibrated scaling to correct it.</w:t>
             </w:r>
           </w:p>
         </w:tc>
@@ -658,7 +668,7 @@
                 <w:i w:val="0"/>
                 <w:sz w:val="17"/>
               </w:rPr>
-              <w:t>ImageNet, COCO, ADE20K.</w:t>
+              <w:t>Transformers under aggressive merging ratios.</w:t>
             </w:r>
           </w:p>
         </w:tc>
@@ -678,7 +688,7 @@
                 <w:i w:val="0"/>
                 <w:sz w:val="17"/>
               </w:rPr>
-              <w:t>Pyramid ViT suits dense prediction.</w:t>
+              <w:t>Existing heuristics such as proportional attention degrade sharply at high compression; calibration targets that regime.</w:t>
             </w:r>
           </w:p>
         </w:tc>
@@ -698,36 +708,7 @@
                 <w:i w:val="0"/>
                 <w:sz w:val="17"/>
               </w:rPr>
-              <w:t>Fixed spatial pyramid; no learned, content-dependent grouping of tokens.</w:t>
-            </w:r>
-          </w:p>
-        </w:tc>
-      </w:tr>
-      <w:tr>
-        <w:trPr>
-          <w:cantSplit w:val="true"/>
-        </w:trPr>
-        <w:tc>
-          <w:tcPr>
-            <w:tcW w:type="dxa" w:w="3912"/>
-            <w:gridSpan w:val="6"/>
-            <w:vAlign w:val="center"/>
-            <w:shd w:val="clear" w:color="auto" w:fill="D3E3E9"/>
-          </w:tcPr>
-          <w:p>
-            <w:pPr>
-              <w:keepNext/>
-              <w:spacing w:after="0" w:before="0"/>
-            </w:pPr>
-            <w:r/>
-            <w:r>
-              <w:rPr>
-                <w:b/>
-                <w:i w:val="0"/>
-                <w:color w:val="0F2A3D"/>
-                <w:sz w:val="17"/>
-              </w:rPr>
-              <w:t>TOKEN REDUCTION</w:t>
+              <w:t>Documents the failure mode of merging at high compression. Our design keeps the full micro stream and adds macro tokens, a different trade-off that is not compared.</w:t>
             </w:r>
           </w:p>
         </w:tc>
@@ -775,7 +756,7 @@
                 <w:color w:val="0F2A3D"/>
                 <w:sz w:val="17"/>
               </w:rPr>
-              <w:t>Rao et al., DynamicViT (NeurIPS 2021)</w:t>
+              <w:t>Schlesinger et al., SPOT (CVPR 2026 Findings)</w:t>
             </w:r>
           </w:p>
         </w:tc>
@@ -796,7 +777,7 @@
                 <w:i w:val="0"/>
                 <w:sz w:val="17"/>
               </w:rPr>
-              <w:t>Lightweight prediction modules progressively prune uninformative tokens.</w:t>
+              <w:t>Lightweight plug-and-play framework that uses compact attention representations to prune redundant tokens before attention is computed.</w:t>
             </w:r>
           </w:p>
         </w:tc>
@@ -817,7 +798,7 @@
                 <w:i w:val="0"/>
                 <w:sz w:val="17"/>
               </w:rPr>
-              <w:t>ImageNet-1k, pretrained backbones.</w:t>
+              <w:t>Pretrained ViTs; quadratic attention cost.</w:t>
             </w:r>
           </w:p>
         </w:tc>
@@ -838,7 +819,7 @@
                 <w:i w:val="0"/>
                 <w:sz w:val="17"/>
               </w:rPr>
-              <w:t>Large FLOP savings at small accuracy loss.</w:t>
+              <w:t>Early detection of less salient tokens reduces computation.</w:t>
             </w:r>
           </w:p>
         </w:tc>
@@ -859,7 +840,7 @@
                 <w:i w:val="0"/>
                 <w:sz w:val="17"/>
               </w:rPr>
-              <w:t>Targets inference efficiency of a pretrained backbone and discards tokens irreversibly; not a representational component trained from scratch.</w:t>
+              <w:t>Pruning discards tokens irreversibly and is aimed at inference cost, not at the question of what learned grouping represents.</w:t>
             </w:r>
           </w:p>
         </w:tc>
@@ -905,7 +886,7 @@
                 <w:color w:val="0F2A3D"/>
                 <w:sz w:val="17"/>
               </w:rPr>
-              <w:t>Bolya et al., ToMe (ICLR 2023)</w:t>
+              <w:t>Wang &amp; Yang, LTM-Transformer (IEEE TPAMI 2025)</w:t>
             </w:r>
           </w:p>
         </w:tc>
@@ -925,7 +906,7 @@
                 <w:i w:val="0"/>
                 <w:sz w:val="17"/>
               </w:rPr>
-              <w:t>Bipartite soft matching merges similar tokens between blocks; training-free.</w:t>
+              <w:t>Learnable Token Merging (LTM): learned merging of redundant tokens, guided by an information-bottleneck objective.</w:t>
             </w:r>
           </w:p>
         </w:tc>
@@ -945,7 +926,7 @@
                 <w:i w:val="0"/>
                 <w:sz w:val="17"/>
               </w:rPr>
-              <w:t>ImageNet-1k, video and audio models.</w:t>
+              <w:t>ViT acceleration; edge deployment.</w:t>
             </w:r>
           </w:p>
         </w:tc>
@@ -965,7 +946,7 @@
                 <w:i w:val="0"/>
                 <w:sz w:val="17"/>
               </w:rPr>
-              <w:t>Roughly doubles throughput on pretrained ViTs with small accuracy loss.</w:t>
+              <w:t>Learned merging improves the accuracy-efficiency trade-off over fixed merging rules.</w:t>
             </w:r>
           </w:p>
         </w:tc>
@@ -985,7 +966,36 @@
                 <w:i w:val="0"/>
                 <w:sz w:val="17"/>
               </w:rPr>
-              <w:t>Designed for pretrained, inference-time use. Our from-scratch ToMe baseline (63.01%, one seed, different recipe) is not a fair verdict on the method.</w:t>
+              <w:t>Closest learned-merging baseline, but we found no usable public implementation: two re-implementation attempts (about 100 GPU-hours) diverged, so it remains an unverified baseline.</w:t>
+            </w:r>
+          </w:p>
+        </w:tc>
+      </w:tr>
+      <w:tr>
+        <w:trPr>
+          <w:cantSplit w:val="true"/>
+        </w:trPr>
+        <w:tc>
+          <w:tcPr>
+            <w:tcW w:type="dxa" w:w="3912"/>
+            <w:gridSpan w:val="6"/>
+            <w:vAlign w:val="center"/>
+            <w:shd w:val="clear" w:color="auto" w:fill="D3E3E9"/>
+          </w:tcPr>
+          <w:p>
+            <w:pPr>
+              <w:keepNext/>
+              <w:spacing w:after="0" w:before="0"/>
+            </w:pPr>
+            <w:r/>
+            <w:r>
+              <w:rPr>
+                <w:b/>
+                <w:i w:val="0"/>
+                <w:color w:val="0F2A3D"/>
+                <w:sz w:val="17"/>
+              </w:rPr>
+              <w:t>HIERARCHICAL AND ADAPTIVE TOKENIZATION</w:t>
             </w:r>
           </w:p>
         </w:tc>
@@ -1033,7 +1043,7 @@
                 <w:color w:val="0F2A3D"/>
                 <w:sz w:val="17"/>
               </w:rPr>
-              <w:t>Marin et al., Token Pooling (WACV 2023)</w:t>
+              <w:t>Yu et al., Stepwise patch merging (IJCAI 2025)</w:t>
             </w:r>
           </w:p>
         </w:tc>
@@ -1054,7 +1064,7 @@
                 <w:i w:val="0"/>
                 <w:sz w:val="17"/>
               </w:rPr>
-              <w:t>Clustering-based (non-learned) down-sampling of tokens between layers.</w:t>
+              <w:t>Replaces the rigid fixed-grid down-sampling (for example strided convolution) of hierarchical ViTs with a brain-inspired, stepwise patch-merging scheme.</w:t>
             </w:r>
           </w:p>
         </w:tc>
@@ -1075,7 +1085,7 @@
                 <w:i w:val="0"/>
                 <w:sz w:val="17"/>
               </w:rPr>
-              <w:t>ImageNet-1k.</w:t>
+              <w:t>Hierarchical vision transformers.</w:t>
             </w:r>
           </w:p>
         </w:tc>
@@ -1096,7 +1106,7 @@
                 <w:i w:val="0"/>
                 <w:sz w:val="17"/>
               </w:rPr>
-              <w:t>Better accuracy-computation trade-off than uniform pooling.</w:t>
+              <w:t>Argues that fixed-grid merging treats all pixels equally and misses multi-scale structure.</w:t>
             </w:r>
           </w:p>
         </w:tc>
@@ -1117,7 +1127,7 @@
                 <w:i w:val="0"/>
                 <w:sz w:val="17"/>
               </w:rPr>
-              <w:t>Clustering is not trained end-to-end; tokens are fused irreversibly; no comparison with capacity controls.</w:t>
+              <w:t>Still a designed merging schedule rather than content-driven grouping; a relevant member of the Swin-style comparator family for RO2.</w:t>
             </w:r>
           </w:p>
         </w:tc>
@@ -1163,7 +1173,7 @@
                 <w:color w:val="0F2A3D"/>
                 <w:sz w:val="17"/>
               </w:rPr>
-              <w:t>Wang &amp; Yang, LTM-Transformer (IEEE TPAMI 2025)</w:t>
+              <w:t>Yin et al., DART (arXiv 2025)</w:t>
             </w:r>
           </w:p>
         </w:tc>
@@ -1183,7 +1193,7 @@
                 <w:i w:val="0"/>
                 <w:sz w:val="17"/>
               </w:rPr>
-              <w:t>Learnable token merging guided by an information-bottleneck objective.</w:t>
+              <w:t>Fully differentiable tokenizer that forms dynamic, content-adaptive regions in place of the fixed-grid tokenizer of ViT and Vision Mamba.</w:t>
             </w:r>
           </w:p>
         </w:tc>
@@ -1203,7 +1213,7 @@
                 <w:i w:val="0"/>
                 <w:sz w:val="17"/>
               </w:rPr>
-              <w:t>ImageNet-1k.</w:t>
+              <w:t>ViT and Vim backbones.</w:t>
             </w:r>
           </w:p>
         </w:tc>
@@ -1223,7 +1233,7 @@
                 <w:i w:val="0"/>
                 <w:sz w:val="17"/>
               </w:rPr>
-              <w:t>Learned merging improves the accuracy-efficiency trade-off.</w:t>
+              <w:t>Argues fixed-grid tokenizers force a trade-off between fine detail and redundant computation.</w:t>
             </w:r>
           </w:p>
         </w:tc>
@@ -1243,36 +1253,7 @@
                 <w:i w:val="0"/>
                 <w:sz w:val="17"/>
               </w:rPr>
-              <w:t>No public implementation we could use: two re-implementation attempts (about 100 GPU-hours) diverged, so it remains an unverified baseline.</w:t>
-            </w:r>
-          </w:p>
-        </w:tc>
-      </w:tr>
-      <w:tr>
-        <w:trPr>
-          <w:cantSplit w:val="true"/>
-        </w:trPr>
-        <w:tc>
-          <w:tcPr>
-            <w:tcW w:type="dxa" w:w="3912"/>
-            <w:gridSpan w:val="6"/>
-            <w:vAlign w:val="center"/>
-            <w:shd w:val="clear" w:color="auto" w:fill="D3E3E9"/>
-          </w:tcPr>
-          <w:p>
-            <w:pPr>
-              <w:keepNext/>
-              <w:spacing w:after="0" w:before="0"/>
-            </w:pPr>
-            <w:r/>
-            <w:r>
-              <w:rPr>
-                <w:b/>
-                <w:i w:val="0"/>
-                <w:color w:val="0F2A3D"/>
-                <w:sz w:val="17"/>
-              </w:rPr>
-              <w:t>LEARNED GROUPING</w:t>
+              <w:t>Adapts tokenization at the input; our branch groups tokens mid-network. Neither has been compared under matched capacity and per-arm tuning.</w:t>
             </w:r>
           </w:p>
         </w:tc>
@@ -1320,7 +1301,7 @@
                 <w:color w:val="0F2A3D"/>
                 <w:sz w:val="17"/>
               </w:rPr>
-              <w:t>Ryoo et al., TokenLearner (NeurIPS 2021)</w:t>
+              <w:t>Duggal et al., Adaptive-length tokenization (ICLR 2025)</w:t>
             </w:r>
           </w:p>
         </w:tc>
@@ -1341,7 +1322,7 @@
                 <w:i w:val="0"/>
                 <w:sz w:val="17"/>
               </w:rPr>
-              <w:t>Spatial-attention modules learn a small set of tokens (for example 8) from the full token map.</w:t>
+              <w:t>Learns variable-length token representations for 2D images, allocating more tokens to higher-entropy content.</w:t>
             </w:r>
           </w:p>
         </w:tc>
@@ -1362,7 +1343,7 @@
                 <w:i w:val="0"/>
                 <w:sz w:val="17"/>
               </w:rPr>
-              <w:t>ImageNet, video benchmarks.</w:t>
+              <w:t>Image tokenization.</w:t>
             </w:r>
           </w:p>
         </w:tc>
@@ -1383,7 +1364,7 @@
                 <w:i w:val="0"/>
                 <w:sz w:val="17"/>
               </w:rPr>
-              <w:t>Few learned tokens cut compute with competitive accuracy.</w:t>
+              <w:t>Shows that token count can follow image complexity instead of being fixed.</w:t>
             </w:r>
           </w:p>
         </w:tc>
@@ -1404,7 +1385,7 @@
                 <w:i w:val="0"/>
                 <w:sz w:val="17"/>
               </w:rPr>
-              <w:t>Closest prior art to a learned slot bottleneck; not compared in the minor project. Its benefit is not separated from simply adding or removing capacity.</w:t>
+              <w:t>Motivates content-dependent granularity, but in a tokenizer setting; our minor project's 'dynamic K' claim failed verification, so this question is open for classifiers.</w:t>
             </w:r>
           </w:p>
         </w:tc>
@@ -1450,7 +1431,7 @@
                 <w:color w:val="0F2A3D"/>
                 <w:sz w:val="17"/>
               </w:rPr>
-              <w:t>Renggli et al., PatchMerger (arXiv 2022)</w:t>
+              <w:t>Khadka et al., CoSwin (arXiv 2025)</w:t>
             </w:r>
           </w:p>
         </w:tc>
@@ -1470,7 +1451,7 @@
                 <w:i w:val="0"/>
                 <w:sz w:val="17"/>
               </w:rPr>
-              <w:t>PatchMerger: a learned module merges tokens into a smaller set between two layers.</w:t>
+              <w:t>Adds convolutional locality to a hierarchical shifted-window ViT for small datasets.</w:t>
             </w:r>
           </w:p>
         </w:tc>
@@ -1490,7 +1471,7 @@
                 <w:i w:val="0"/>
                 <w:sz w:val="17"/>
               </w:rPr>
-              <w:t>Large-scale image classification and transfer.</w:t>
+              <w:t>Small-scale vision data sets.</w:t>
             </w:r>
           </w:p>
         </w:tc>
@@ -1510,7 +1491,7 @@
                 <w:i w:val="0"/>
                 <w:sz w:val="17"/>
               </w:rPr>
-              <w:t>Reduces compute with little accuracy loss.</w:t>
+              <w:t>Small-data ViTs lack locality and translation equivariance; hierarchical designs need such inductive biases.</w:t>
             </w:r>
           </w:p>
         </w:tc>
@@ -1530,7 +1511,36 @@
                 <w:i w:val="0"/>
                 <w:sz w:val="17"/>
               </w:rPr>
-              <w:t>Compute-reduction framing; not evaluated against equal-capacity controls or for region quality.</w:t>
+              <w:t>Same small-data regime as ours, with a hand-designed prior. It is a relevant baseline for RO2 and RO3.</w:t>
+            </w:r>
+          </w:p>
+        </w:tc>
+      </w:tr>
+      <w:tr>
+        <w:trPr>
+          <w:cantSplit w:val="true"/>
+        </w:trPr>
+        <w:tc>
+          <w:tcPr>
+            <w:tcW w:type="dxa" w:w="3912"/>
+            <w:gridSpan w:val="6"/>
+            <w:vAlign w:val="center"/>
+            <w:shd w:val="clear" w:color="auto" w:fill="D3E3E9"/>
+          </w:tcPr>
+          <w:p>
+            <w:pPr>
+              <w:keepNext/>
+              <w:spacing w:after="0" w:before="0"/>
+            </w:pPr>
+            <w:r/>
+            <w:r>
+              <w:rPr>
+                <w:b/>
+                <w:i w:val="0"/>
+                <w:color w:val="0F2A3D"/>
+                <w:sz w:val="17"/>
+              </w:rPr>
+              <w:t>EXTRA TOKENS AND REGISTERS</w:t>
             </w:r>
           </w:p>
         </w:tc>
@@ -1578,7 +1588,7 @@
                 <w:color w:val="0F2A3D"/>
                 <w:sz w:val="17"/>
               </w:rPr>
-              <w:t>Locatello et al., Slot Attention (NeurIPS 2020)</w:t>
+              <w:t>Jiang et al., ViTs don't need trained registers (NeurIPS 2025)</w:t>
             </w:r>
           </w:p>
         </w:tc>
@@ -1599,7 +1609,7 @@
                 <w:i w:val="0"/>
                 <w:sz w:val="17"/>
               </w:rPr>
-              <w:t>Iterative competitive attention binds inputs to a set of slots without segmentation labels.</w:t>
+              <w:t>Traces high-norm outlier tokens (as in CLIP and DINOv2) to a sparse set of neurons and removes the artifact without training registers.</w:t>
             </w:r>
           </w:p>
         </w:tc>
@@ -1620,7 +1630,7 @@
                 <w:i w:val="0"/>
                 <w:sz w:val="17"/>
               </w:rPr>
-              <w:t>Mostly synthetic multi-object scenes.</w:t>
+              <w:t>Pretrained CLIP and DINOv2 models.</w:t>
             </w:r>
           </w:p>
         </w:tc>
@@ -1641,7 +1651,7 @@
                 <w:i w:val="0"/>
                 <w:sz w:val="17"/>
               </w:rPr>
-              <w:t>Object-centric slots emerge from unsupervised training on simple scenes.</w:t>
+              <w:t>Outlier tokens and noisy attention maps can be fixed at test time.</w:t>
             </w:r>
           </w:p>
         </w:tc>
@@ -1662,7 +1672,7 @@
                 <w:i w:val="0"/>
                 <w:sz w:val="17"/>
               </w:rPr>
-              <w:t>Iterative refinement is costly; shown mainly on synthetic scenes. Whether one feed-forward top-k assignment trained from class labels is enough is unexamined.</w:t>
+              <w:t>Shows that register effects have a mechanistic explanation, so our register-style control (arm R) must be interpreted by what extra tokens do, not only by capacity.</w:t>
             </w:r>
           </w:p>
         </w:tc>
@@ -1708,7 +1718,7 @@
                 <w:color w:val="0F2A3D"/>
                 <w:sz w:val="17"/>
               </w:rPr>
-              <w:t>Xu et al., GroupViT (CVPR 2022)</w:t>
+              <w:t>Yan et al., Self-distilled registers (NeurIPS 2025)</w:t>
             </w:r>
           </w:p>
         </w:tc>
@@ -1728,7 +1738,7 @@
                 <w:i w:val="0"/>
                 <w:sz w:val="17"/>
               </w:rPr>
-              <w:t>Hierarchical grouping of patch tokens into group tokens with Gumbel-softmax assignment.</w:t>
+              <w:t>Post-hoc registers: adds register tokens to pretrained ViTs through self-distillation, without full retraining.</w:t>
             </w:r>
           </w:p>
         </w:tc>
@@ -1748,7 +1758,7 @@
                 <w:i w:val="0"/>
                 <w:sz w:val="17"/>
               </w:rPr>
-              <w:t>Large image-text pairs; zero-shot segmentation.</w:t>
+              <w:t>Pretrained ViTs; dense prediction.</w:t>
             </w:r>
           </w:p>
         </w:tc>
@@ -1768,7 +1778,7 @@
                 <w:i w:val="0"/>
                 <w:sz w:val="17"/>
               </w:rPr>
-              <w:t>Segmentation emerges from text supervision alone.</w:t>
+              <w:t>Artifact tokens degrade segmentation-style tasks, and registers recover performance.</w:t>
             </w:r>
           </w:p>
         </w:tc>
@@ -1788,7 +1798,7 @@
                 <w:i w:val="0"/>
                 <w:sz w:val="17"/>
               </w:rPr>
-              <w:t>Requires large-scale image-text pre-training; our setting (labels only, small data) is untested for this mechanism.</w:t>
+              <w:t>Registers are studied in large pretrained ViTs, not in small from-scratch hierarchical models.</w:t>
             </w:r>
           </w:p>
         </w:tc>
@@ -1836,7 +1846,7 @@
                 <w:color w:val="0F2A3D"/>
                 <w:sz w:val="17"/>
               </w:rPr>
-              <w:t>Seitzer et al., DINOSAUR (ICLR 2023)</w:t>
+              <w:t>Lappe &amp; Giese, Register and [CLS] tokens (NeurIPS 2025)</w:t>
             </w:r>
           </w:p>
         </w:tc>
@@ -1857,7 +1867,7 @@
                 <w:i w:val="0"/>
                 <w:sz w:val="17"/>
               </w:rPr>
-              <w:t>Slot-based decoder reconstructs self-supervised features instead of pixels.</w:t>
+              <w:t>Analyses how register tokens or internal skip connections decouple local patch features from the global [CLS] representation.</w:t>
             </w:r>
           </w:p>
         </w:tc>
@@ -1878,7 +1888,7 @@
                 <w:i w:val="0"/>
                 <w:sz w:val="17"/>
               </w:rPr>
-              <w:t>COCO, PASCAL VOC.</w:t>
+              <w:t>Large pretrained ViTs such as DINOv2.</w:t>
             </w:r>
           </w:p>
         </w:tc>
@@ -1899,7 +1909,7 @@
                 <w:i w:val="0"/>
                 <w:sz w:val="17"/>
               </w:rPr>
-              <w:t>Object-centric learning scales to real images with good mask metrics.</w:t>
+              <w:t>High-performing models rely on registers or skip connections to route global information.</w:t>
             </w:r>
           </w:p>
         </w:tc>
@@ -1920,7 +1930,7 @@
                 <w:i w:val="0"/>
                 <w:sz w:val="17"/>
               </w:rPr>
-              <w:t>Depends on a pretrained self-supervised encoder; gives mask metrics we can borrow, but not for classification-trained, from-scratch hierarchies.</w:t>
+              <w:t>Shows extra tokens change information routing inside the model, an effect never separated from learned routing in our design.</w:t>
             </w:r>
           </w:p>
         </w:tc>
@@ -1966,7 +1976,7 @@
                 <w:color w:val="0F2A3D"/>
                 <w:sz w:val="17"/>
               </w:rPr>
-              <w:t>Jaegle et al., Perceiver (ICML 2021)</w:t>
+              <w:t>Tang &amp; Qi, The extra tokens matter (ICML 2026)</w:t>
             </w:r>
           </w:p>
         </w:tc>
@@ -1986,7 +1996,7 @@
                 <w:i w:val="0"/>
                 <w:sz w:val="17"/>
               </w:rPr>
-              <w:t>Cross-attention from a large input array into a small latent bottleneck.</w:t>
+              <w:t>Regularises the extra tokens of a ViT into semantically disentangled factor tokens that correspond to object parts, with no manual labels.</w:t>
             </w:r>
           </w:p>
         </w:tc>
@@ -2006,7 +2016,7 @@
                 <w:i w:val="0"/>
                 <w:sz w:val="17"/>
               </w:rPr>
-              <w:t>ImageNet, audio, point clouds.</w:t>
+              <w:t>ViT representation learning.</w:t>
             </w:r>
           </w:p>
         </w:tc>
@@ -2026,7 +2036,7 @@
                 <w:i w:val="0"/>
                 <w:sz w:val="17"/>
               </w:rPr>
-              <w:t>Modality-agnostic model with cost linear in input size.</w:t>
+              <w:t>Extra tokens can be given semantic structure through a geometric volume constraint.</w:t>
             </w:r>
           </w:p>
         </w:tc>
@@ -2046,7 +2056,36 @@
                 <w:i w:val="0"/>
                 <w:sz w:val="17"/>
               </w:rPr>
-              <w:t>Latents are input-independent and weakly inductive; no hierarchy or locality, and no controlled comparison of learned routing versus plain latents.</w:t>
+              <w:t>Closest in spirit to slots as parts, but the tokens are not routed from patches; it has not been compared with routed grouping at matched capacity.</w:t>
+            </w:r>
+          </w:p>
+        </w:tc>
+      </w:tr>
+      <w:tr>
+        <w:trPr>
+          <w:cantSplit w:val="true"/>
+        </w:trPr>
+        <w:tc>
+          <w:tcPr>
+            <w:tcW w:type="dxa" w:w="3912"/>
+            <w:gridSpan w:val="6"/>
+            <w:vAlign w:val="center"/>
+            <w:shd w:val="clear" w:color="auto" w:fill="D3E3E9"/>
+          </w:tcPr>
+          <w:p>
+            <w:pPr>
+              <w:keepNext/>
+              <w:spacing w:after="0" w:before="0"/>
+            </w:pPr>
+            <w:r/>
+            <w:r>
+              <w:rPr>
+                <w:b/>
+                <w:i w:val="0"/>
+                <w:color w:val="0F2A3D"/>
+                <w:sz w:val="17"/>
+              </w:rPr>
+              <w:t>OBJECT-CENTRIC AND SLOT-BASED LEARNING</w:t>
             </w:r>
           </w:p>
         </w:tc>
@@ -2094,7 +2133,7 @@
                 <w:color w:val="0F2A3D"/>
                 <w:sz w:val="17"/>
               </w:rPr>
-              <w:t>Darcet et al., Registers (ICLR 2024)</w:t>
+              <w:t>Dukic et al., Target-encoder bootstrapping (ICLR 2025)</w:t>
             </w:r>
           </w:p>
         </w:tc>
@@ -2115,7 +2154,7 @@
                 <w:i w:val="0"/>
                 <w:sz w:val="17"/>
               </w:rPr>
-              <w:t>Extra learnable, input-independent tokens appended to a ViT absorb high-norm artifact tokens.</w:t>
+              <w:t>Slot-attention models trained to reconstruct frozen foundation-model features; bootstraps the target encoder to lift the ceiling of frozen targets.</w:t>
             </w:r>
           </w:p>
         </w:tc>
@@ -2136,7 +2175,7 @@
                 <w:i w:val="0"/>
                 <w:sz w:val="17"/>
               </w:rPr>
-              <w:t>DeiT-III, OpenCLIP, DINOv2 backbones.</w:t>
+              <w:t>Real-world object-centric benchmarks.</w:t>
             </w:r>
           </w:p>
         </w:tc>
@@ -2157,7 +2196,7 @@
                 <w:i w:val="0"/>
                 <w:sz w:val="17"/>
               </w:rPr>
-              <w:t>Registers remove artifacts and improve dense features.</w:t>
+              <w:t>Frozen reconstruction targets bound what object-centric models can reach; bootstrapping relaxes it.</w:t>
             </w:r>
           </w:p>
         </w:tc>
@@ -2178,36 +2217,7 @@
                 <w:i w:val="0"/>
                 <w:sz w:val="17"/>
               </w:rPr>
-              <w:t>Shows extra input-independent tokens alone help, so any benefit of learned grouping must be separated from added tokens. This is the central control missing from the minor project.</w:t>
-            </w:r>
-          </w:p>
-        </w:tc>
-      </w:tr>
-      <w:tr>
-        <w:trPr>
-          <w:cantSplit w:val="true"/>
-        </w:trPr>
-        <w:tc>
-          <w:tcPr>
-            <w:tcW w:type="dxa" w:w="3912"/>
-            <w:gridSpan w:val="6"/>
-            <w:vAlign w:val="center"/>
-            <w:shd w:val="clear" w:color="auto" w:fill="D3E3E9"/>
-          </w:tcPr>
-          <w:p>
-            <w:pPr>
-              <w:keepNext/>
-              <w:spacing w:after="0" w:before="0"/>
-            </w:pPr>
-            <w:r/>
-            <w:r>
-              <w:rPr>
-                <w:b/>
-                <w:i w:val="0"/>
-                <w:color w:val="0F2A3D"/>
-                <w:sz w:val="17"/>
-              </w:rPr>
-              <w:t>EMERGENT REGIONS</w:t>
+              <w:t>Needs a reconstruction objective and foundation-model features; it does not address grouping trained from class labels alone.</w:t>
             </w:r>
           </w:p>
         </w:tc>
@@ -2253,7 +2263,7 @@
                 <w:color w:val="0F2A3D"/>
                 <w:sz w:val="17"/>
               </w:rPr>
-              <w:t>Caron et al., DINO (ICCV 2021)</w:t>
+              <w:t>Singh et al., GLASS (CVPR 2025)</w:t>
             </w:r>
           </w:p>
         </w:tc>
@@ -2273,7 +2283,7 @@
                 <w:i w:val="0"/>
                 <w:sz w:val="17"/>
               </w:rPr>
-              <w:t>Self-distillation; ViT attention maps expose object layout without labels.</w:t>
+              <w:t>Guided latent slot diffusion for decomposing real-world images into object slots.</w:t>
             </w:r>
           </w:p>
         </w:tc>
@@ -2293,7 +2303,7 @@
                 <w:i w:val="0"/>
                 <w:sz w:val="17"/>
               </w:rPr>
-              <w:t>ImageNet; DAVIS video segmentation.</w:t>
+              <w:t>Real-world images with multiple textured objects.</w:t>
             </w:r>
           </w:p>
         </w:tc>
@@ -2313,7 +2323,7 @@
                 <w:i w:val="0"/>
                 <w:sz w:val="17"/>
               </w:rPr>
-              <w:t>Semantic layout emerges in self-supervised ViT attention.</w:t>
+              <w:t>Object-centric learning struggles on real-world data; guidance in a diffusion decoder helps.</w:t>
             </w:r>
           </w:p>
         </w:tc>
@@ -2333,7 +2343,7 @@
                 <w:i w:val="0"/>
                 <w:sz w:val="17"/>
               </w:rPr>
-              <w:t>Reference point for 'emergent regions', but our own region figures are qualitative only and not scored against masks.</w:t>
+              <w:t>Generative diffusion decoders are far heavier than a feed-forward router and serve a different goal from classification backbones.</w:t>
             </w:r>
           </w:p>
         </w:tc>
@@ -2381,7 +2391,7 @@
                 <w:color w:val="0F2A3D"/>
                 <w:sz w:val="17"/>
               </w:rPr>
-              <w:t>Gao et al., ImageNet-S (IEEE TPAMI 2023)</w:t>
+              <w:t>Akan, Slots in real-world scenarios (arXiv 2025)</w:t>
             </w:r>
           </w:p>
         </w:tc>
@@ -2402,7 +2412,7 @@
                 <w:i w:val="0"/>
                 <w:sz w:val="17"/>
               </w:rPr>
-              <w:t>ImageNet-scale benchmark with pixel-level masks (ImageNet-S) for evaluating unsupervised segmentation.</w:t>
+              <w:t>SlotAdapt: lightweight adapters and a register token that connect object-centric slots to pretrained diffusion models.</w:t>
             </w:r>
           </w:p>
         </w:tc>
@@ -2423,7 +2433,7 @@
                 <w:i w:val="0"/>
                 <w:sz w:val="17"/>
               </w:rPr>
-              <w:t>ImageNet-1k with annotated mask subsets.</w:t>
+              <w:t>Real-world scenes; generative models.</w:t>
             </w:r>
           </w:p>
         </w:tc>
@@ -2444,7 +2454,7 @@
                 <w:i w:val="0"/>
                 <w:sz w:val="17"/>
               </w:rPr>
-              <w:t>Provides mask-level evaluation at ImageNet scale.</w:t>
+              <w:t>Combining slots with a register token bridges object-centric learning and high-fidelity diffusion models.</w:t>
             </w:r>
           </w:p>
         </w:tc>
@@ -2465,7 +2475,7 @@
                 <w:i w:val="0"/>
                 <w:sz w:val="17"/>
               </w:rPr>
-              <w:t>Gives the mask protocol for RO4, but ImageNet-scale evaluation is compute-heavy; a class-subset protocol must be fixed in advance.</w:t>
+              <w:t>Uses a register token alongside slots, which reinforces the need for a register control when claiming slot benefits.</w:t>
             </w:r>
           </w:p>
         </w:tc>
@@ -2494,7 +2504,7 @@
                 <w:color w:val="0F2A3D"/>
                 <w:sz w:val="17"/>
               </w:rPr>
-              <w:t>CAUSAL EMERGENCE</w:t>
+              <w:t>DENSE FEATURES AND EMERGENT REGIONS</w:t>
             </w:r>
           </w:p>
         </w:tc>
@@ -2540,7 +2550,7 @@
                 <w:color w:val="0F2A3D"/>
                 <w:sz w:val="17"/>
               </w:rPr>
-              <w:t>Hoel et al., Causal emergence (PNAS 2013)</w:t>
+              <w:t>Simeoni et al., DINOv3 (arXiv 2025)</w:t>
             </w:r>
           </w:p>
         </w:tc>
@@ -2560,7 +2570,7 @@
                 <w:i w:val="0"/>
                 <w:sz w:val="17"/>
               </w:rPr>
-              <w:t>Effective information (EI) of a macro-scale description can exceed that of the micro-scale.</w:t>
+              <w:t>Self-supervised foundation model scaled in data and parameters; 'Gram anchoring' to keep dense feature maps clean.</w:t>
             </w:r>
           </w:p>
         </w:tc>
@@ -2580,7 +2590,7 @@
                 <w:i w:val="0"/>
                 <w:sz w:val="17"/>
               </w:rPr>
-              <w:t>Discrete Markov systems.</w:t>
+              <w:t>Very large-scale self-supervised pre-training; many tasks without fine-tuning.</w:t>
             </w:r>
           </w:p>
         </w:tc>
@@ -2600,7 +2610,7 @@
                 <w:i w:val="0"/>
                 <w:sz w:val="17"/>
               </w:rPr>
-              <w:t>Defines causal emergence formally.</w:t>
+              <w:t>Strong dense features without annotation.</w:t>
             </w:r>
           </w:p>
         </w:tc>
@@ -2620,36 +2630,7 @@
                 <w:i w:val="0"/>
                 <w:sz w:val="17"/>
               </w:rPr>
-              <w:t>No faithful, scalable operationalisation inside a vision transformer exists; our minor project's loss did not compute EI and that framing was withdrawn.</w:t>
-            </w:r>
-          </w:p>
-        </w:tc>
-      </w:tr>
-      <w:tr>
-        <w:trPr>
-          <w:cantSplit w:val="true"/>
-        </w:trPr>
-        <w:tc>
-          <w:tcPr>
-            <w:tcW w:type="dxa" w:w="3912"/>
-            <w:gridSpan w:val="6"/>
-            <w:vAlign w:val="center"/>
-            <w:shd w:val="clear" w:color="auto" w:fill="D3E3E9"/>
-          </w:tcPr>
-          <w:p>
-            <w:pPr>
-              <w:keepNext/>
-              <w:spacing w:after="0" w:before="0"/>
-            </w:pPr>
-            <w:r/>
-            <w:r>
-              <w:rPr>
-                <w:b/>
-                <w:i w:val="0"/>
-                <w:color w:val="0F2A3D"/>
-                <w:sz w:val="17"/>
-              </w:rPr>
-              <w:t>EVALUATION RIGOUR</w:t>
+              <w:t>Sets the bar for region quality at a scale we cannot reproduce; usable only as a frozen reference for region baselines in RO4.</w:t>
             </w:r>
           </w:p>
         </w:tc>
@@ -2697,7 +2678,7 @@
                 <w:color w:val="0F2A3D"/>
                 <w:sz w:val="17"/>
               </w:rPr>
-              <w:t>Steiner et al., How to train your ViT? (TMLR 2022)</w:t>
+              <w:t>Rawlekar et al., Object DINO (CVPR 2026)</w:t>
             </w:r>
           </w:p>
         </w:tc>
@@ -2718,7 +2699,7 @@
                 <w:i w:val="0"/>
                 <w:sz w:val="17"/>
               </w:rPr>
-              <w:t>Large study of augmentation, regularisation and compute for ViT training.</w:t>
+              <w:t>Training-free extraction of cleaner object maps from distributed properties of self-supervised ViTs, because [CLS] attention maps are noisy.</w:t>
             </w:r>
           </w:p>
         </w:tc>
@@ -2739,7 +2720,7 @@
                 <w:i w:val="0"/>
                 <w:sz w:val="17"/>
               </w:rPr>
-              <w:t>ImageNet-21k and ImageNet-1k.</w:t>
+              <w:t>Self-supervised ViTs such as DINO.</w:t>
             </w:r>
           </w:p>
         </w:tc>
@@ -2760,7 +2741,7 @@
                 <w:i w:val="0"/>
                 <w:sz w:val="17"/>
               </w:rPr>
-              <w:t>Training recipe changes ViT results as much as many architectural changes.</w:t>
+              <w:t>Standard [CLS]-attention localisation contains spurious activations.</w:t>
             </w:r>
           </w:p>
         </w:tc>
@@ -2781,7 +2762,36 @@
                 <w:i w:val="0"/>
                 <w:sz w:val="17"/>
               </w:rPr>
-              <w:t>Implies that one untuned shared recipe can favour any architecture; the minor project tuned neither baseline nor control.</w:t>
+              <w:t>Shows that object localisation from attention depends on the extraction protocol, which is why RO4 fixes metrics and baselines in advance.</w:t>
+            </w:r>
+          </w:p>
+        </w:tc>
+      </w:tr>
+      <w:tr>
+        <w:trPr>
+          <w:cantSplit w:val="true"/>
+        </w:trPr>
+        <w:tc>
+          <w:tcPr>
+            <w:tcW w:type="dxa" w:w="3912"/>
+            <w:gridSpan w:val="6"/>
+            <w:vAlign w:val="center"/>
+            <w:shd w:val="clear" w:color="auto" w:fill="D3E3E9"/>
+          </w:tcPr>
+          <w:p>
+            <w:pPr>
+              <w:keepNext/>
+              <w:spacing w:after="0" w:before="0"/>
+            </w:pPr>
+            <w:r/>
+            <w:r>
+              <w:rPr>
+                <w:b/>
+                <w:i w:val="0"/>
+                <w:color w:val="0F2A3D"/>
+                <w:sz w:val="17"/>
+              </w:rPr>
+              <w:t>EVALUATION RIGOUR</w:t>
             </w:r>
           </w:p>
         </w:tc>
@@ -2827,7 +2837,7 @@
                 <w:color w:val="0F2A3D"/>
                 <w:sz w:val="17"/>
               </w:rPr>
-              <w:t>Wightman et al., ResNet strikes back (arXiv 2021)</w:t>
+              <w:t>Wen et al., Fantastic pretraining optimizers (ICLR 2026)</w:t>
             </w:r>
           </w:p>
         </w:tc>
@@ -2847,7 +2857,7 @@
                 <w:i w:val="0"/>
                 <w:sz w:val="17"/>
               </w:rPr>
-              <w:t>A modern training recipe is applied to a plain ResNet-50.</w:t>
+              <w:t>Rigorous comparison of eleven optimizers across model scales to 1.2B parameters with matched hyper-parameter tuning.</w:t>
             </w:r>
           </w:p>
         </w:tc>
@@ -2867,7 +2877,7 @@
                 <w:i w:val="0"/>
                 <w:sz w:val="17"/>
               </w:rPr>
-              <w:t>ImageNet-1k.</w:t>
+              <w:t>Language-model pretraining.</w:t>
             </w:r>
           </w:p>
         </w:tc>
@@ -2887,7 +2897,7 @@
                 <w:i w:val="0"/>
                 <w:sz w:val="17"/>
               </w:rPr>
-              <w:t>A well-trained plain ResNet-50 is competitive with newer architectures reported under older recipes.</w:t>
+              <w:t>Claimed 1.4x to 2x speedups largely reflect unequal tuning and small-scale tests.</w:t>
             </w:r>
           </w:p>
         </w:tc>
@@ -2907,7 +2917,7 @@
                 <w:i w:val="0"/>
                 <w:sz w:val="17"/>
               </w:rPr>
-              <w:t>Architecture claims are confounded with recipe; every comparison needs per-arm tuning.</w:t>
+              <w:t>Same methodological failure as our audit, in another domain. No equivalent per-arm-tuned comparison exists for token-grouping ViTs.</w:t>
             </w:r>
           </w:p>
         </w:tc>
@@ -2955,7 +2965,7 @@
                 <w:color w:val="0F2A3D"/>
                 <w:sz w:val="17"/>
               </w:rPr>
-              <w:t>Lucic et al., Are GANs created equal? (NeurIPS 2018)</w:t>
+              <w:t>Kasimbeg et al., Hyperparameter-free learning (TMLR 2025)</w:t>
             </w:r>
           </w:p>
         </w:tc>
@@ -2976,7 +2986,7 @@
                 <w:i w:val="0"/>
                 <w:sz w:val="17"/>
               </w:rPr>
-              <w:t>Large-scale, equal-budget hyper-parameter search across GAN variants.</w:t>
+              <w:t>Examines whether learning algorithms can avoid per-workload hyper-parameter tuning.</w:t>
             </w:r>
           </w:p>
         </w:tc>
@@ -2997,7 +3007,7 @@
                 <w:i w:val="0"/>
                 <w:sz w:val="17"/>
               </w:rPr>
-              <w:t>Several image data sets.</w:t>
+              <w:t>Deep-learning workloads.</w:t>
             </w:r>
           </w:p>
         </w:tc>
@@ -3018,7 +3028,7 @@
                 <w:i w:val="0"/>
                 <w:sz w:val="17"/>
               </w:rPr>
-              <w:t>Claimed differences largely vanish under equal tuning budgets and repeated runs.</w:t>
+              <w:t>Per-workload tuning of optimization and regularization hyper-parameters remains crucial and expensive.</w:t>
             </w:r>
           </w:p>
         </w:tc>
@@ -3039,7 +3049,7 @@
                 <w:i w:val="0"/>
                 <w:sz w:val="17"/>
               </w:rPr>
-              <w:t>Direct precedent for our compute- and tuning-matched design; no equivalent study exists for token-grouping ViTs.</w:t>
+              <w:t>Supports tuning every arm separately (RO2) and shows that a single shared recipe is a weak basis for comparison.</w:t>
             </w:r>
           </w:p>
         </w:tc>
@@ -3085,7 +3095,7 @@
                 <w:color w:val="0F2A3D"/>
                 <w:sz w:val="17"/>
               </w:rPr>
-              <w:t>Musgrave et al., Metric learning reality check (ECCV 2020)</w:t>
+              <w:t>Hochlehnert et al., A sober look at LM reasoning (COLM 2025)</w:t>
             </w:r>
           </w:p>
         </w:tc>
@@ -3105,7 +3115,7 @@
                 <w:i w:val="0"/>
                 <w:sz w:val="17"/>
               </w:rPr>
-              <w:t>Re-evaluates metric-learning methods under a fair, uniform protocol.</w:t>
+              <w:t>Empirical study of evaluation practices; proposes a standardised, statistically grounded framework.</w:t>
             </w:r>
           </w:p>
         </w:tc>
@@ -3125,7 +3135,7 @@
                 <w:i w:val="0"/>
                 <w:sz w:val="17"/>
               </w:rPr>
-              <w:t>Image retrieval benchmarks.</w:t>
+              <w:t>Language-model reasoning benchmarks.</w:t>
             </w:r>
           </w:p>
         </w:tc>
@@ -3145,7 +3155,7 @@
                 <w:i w:val="0"/>
                 <w:sz w:val="17"/>
               </w:rPr>
-              <w:t>Reported improvements shrink or vanish under fair comparison.</w:t>
+              <w:t>Reported progress is often inflated by inconsistent, non-robust evaluation; many gains are small.</w:t>
             </w:r>
           </w:p>
         </w:tc>
@@ -3165,7 +3175,36 @@
                 <w:i w:val="0"/>
                 <w:sz w:val="17"/>
               </w:rPr>
-              <w:t>Same failure pattern (untuned baselines, weak protocols) likely applies to token-grouping claims; needs testing.</w:t>
+              <w:t>Different domain, same lesson: variance and transparency decide conclusions. It supports multiple seeds and an OSF-registered plan.</w:t>
+            </w:r>
+          </w:p>
+        </w:tc>
+      </w:tr>
+      <w:tr>
+        <w:trPr>
+          <w:cantSplit w:val="true"/>
+        </w:trPr>
+        <w:tc>
+          <w:tcPr>
+            <w:tcW w:type="dxa" w:w="3912"/>
+            <w:gridSpan w:val="6"/>
+            <w:vAlign w:val="center"/>
+            <w:shd w:val="clear" w:color="auto" w:fill="D3E3E9"/>
+          </w:tcPr>
+          <w:p>
+            <w:pPr>
+              <w:keepNext/>
+              <w:spacing w:after="0" w:before="0"/>
+            </w:pPr>
+            <w:r/>
+            <w:r>
+              <w:rPr>
+                <w:b/>
+                <w:i w:val="0"/>
+                <w:color w:val="0F2A3D"/>
+                <w:sz w:val="17"/>
+              </w:rPr>
+              <w:t>CAUSAL EMERGENCE</w:t>
             </w:r>
           </w:p>
         </w:tc>
@@ -3213,7 +3252,7 @@
                 <w:color w:val="0F2A3D"/>
                 <w:sz w:val="17"/>
               </w:rPr>
-              <w:t>Bouthillier et al., Variance in ML benchmarks (MLSys 2021)</w:t>
+              <w:t>Hoel, Causal emergence 2.0 (arXiv 2025)</w:t>
             </w:r>
           </w:p>
         </w:tc>
@@ -3234,7 +3273,7 @@
                 <w:i w:val="0"/>
                 <w:sz w:val="17"/>
               </w:rPr>
-              <w:t>Quantifies variance from data order, initialisation and tuning; recommends randomising several sources.</w:t>
+              <w:t>Axiomatic extension of causal emergence theory to quantify emergent complexity.</w:t>
             </w:r>
           </w:p>
         </w:tc>
@@ -3255,7 +3294,7 @@
                 <w:i w:val="0"/>
                 <w:sz w:val="17"/>
               </w:rPr>
-              <w:t>Several tasks and models.</w:t>
+              <w:t>Theory.</w:t>
             </w:r>
           </w:p>
         </w:tc>
@@ -3276,7 +3315,7 @@
                 <w:i w:val="0"/>
                 <w:sz w:val="17"/>
               </w:rPr>
-              <w:t>Single-run comparisons can mislead; multiple seeds and sources of variation are needed.</w:t>
+              <w:t>A formal framework for when macro-scale descriptions carry more causal structure.</w:t>
             </w:r>
           </w:p>
         </w:tc>
@@ -3297,36 +3336,7 @@
                 <w:i w:val="0"/>
                 <w:sz w:val="17"/>
               </w:rPr>
-              <w:t>Most minor-project baselines were single-seed; sweeps used one seed (standard error about 0.6 points).</w:t>
-            </w:r>
-          </w:p>
-        </w:tc>
-      </w:tr>
-      <w:tr>
-        <w:trPr>
-          <w:cantSplit w:val="true"/>
-        </w:trPr>
-        <w:tc>
-          <w:tcPr>
-            <w:tcW w:type="dxa" w:w="3912"/>
-            <w:gridSpan w:val="6"/>
-            <w:vAlign w:val="center"/>
-            <w:shd w:val="clear" w:color="auto" w:fill="D3E3E9"/>
-          </w:tcPr>
-          <w:p>
-            <w:pPr>
-              <w:keepNext/>
-              <w:spacing w:after="0" w:before="0"/>
-            </w:pPr>
-            <w:r/>
-            <w:r>
-              <w:rPr>
-                <w:b/>
-                <w:i w:val="0"/>
-                <w:color w:val="0F2A3D"/>
-                <w:sz w:val="17"/>
-              </w:rPr>
-              <w:t>OWN PRIOR WORK</w:t>
+              <w:t>Theory with no validated differentiable vision implementation. Our minor project cited it but never computed Hoel-style effective information, and withdrew that framing.</w:t>
             </w:r>
           </w:p>
         </w:tc>
@@ -3372,7 +3382,7 @@
                 <w:color w:val="0F2A3D"/>
                 <w:sz w:val="17"/>
               </w:rPr>
-              <w:t>Das, Sharma &amp; Eliazer M, CET-ViT (IEEE ICSL-DSGA 2026)</w:t>
+              <w:t>Zhang et al., Reversibility and causal emergence via SVD (npj Complexity 2025)</w:t>
             </w:r>
           </w:p>
         </w:tc>
@@ -3392,7 +3402,7 @@
                 <w:i w:val="0"/>
                 <w:sz w:val="17"/>
               </w:rPr>
-              <w:t>Hierarchical ViT with top-3 sparse routing of 256 tokens into 32 macro-slots (V-CEO) and cross-scale attention.</w:t>
+              <w:t>Connects dynamical reversibility to effective information through an SVD formulation.</w:t>
             </w:r>
           </w:p>
         </w:tc>
@@ -3412,7 +3422,7 @@
                 <w:i w:val="0"/>
                 <w:sz w:val="17"/>
               </w:rPr>
-              <w:t>CIFAR-100, Tiny-ImageNet-200, from scratch.</w:t>
+              <w:t>Dynamical systems.</w:t>
             </w:r>
           </w:p>
         </w:tc>
@@ -3432,7 +3442,7 @@
                 <w:i w:val="0"/>
                 <w:sz w:val="17"/>
               </w:rPr>
-              <w:t>Reported 76.05 +/- 0.09% on CIFAR-100 (3 seeds) vs 72.14% Swin; +0.92 over Swin on Tiny-ImageNet.</w:t>
+              <w:t>An SVD-based route to causal emergence.</w:t>
             </w:r>
           </w:p>
         </w:tc>
@@ -3452,7 +3462,36 @@
                 <w:i w:val="0"/>
                 <w:sz w:val="17"/>
               </w:rPr>
-              <w:t>Single-seed baselines, no capacity-matched control, best-epoch selection on the test split, no mask-level region evaluation, no scale beyond 64x64.</w:t>
+              <w:t>The spectral regulariser of our minor project drew on this idea, but its metric turned out inverted relative to its description and was inactive at the trained operating point.</w:t>
+            </w:r>
+          </w:p>
+        </w:tc>
+      </w:tr>
+      <w:tr>
+        <w:trPr>
+          <w:cantSplit w:val="true"/>
+        </w:trPr>
+        <w:tc>
+          <w:tcPr>
+            <w:tcW w:type="dxa" w:w="3912"/>
+            <w:gridSpan w:val="6"/>
+            <w:vAlign w:val="center"/>
+            <w:shd w:val="clear" w:color="auto" w:fill="D3E3E9"/>
+          </w:tcPr>
+          <w:p>
+            <w:pPr>
+              <w:keepNext/>
+              <w:spacing w:after="0" w:before="0"/>
+            </w:pPr>
+            <w:r/>
+            <w:r>
+              <w:rPr>
+                <w:b/>
+                <w:i w:val="0"/>
+                <w:color w:val="0F2A3D"/>
+                <w:sz w:val="17"/>
+              </w:rPr>
+              <w:t>OWN PRIOR WORK</w:t>
             </w:r>
           </w:p>
         </w:tc>
@@ -3500,7 +3539,7 @@
                 <w:color w:val="0F2A3D"/>
                 <w:sz w:val="17"/>
               </w:rPr>
-              <w:t>Das, Compute-matched audit (private draft v13, 2026)</w:t>
+              <w:t>Das, Sharma &amp; Eliazer M, CET-ViT (IEEE ICSL-DSGA 2026)</w:t>
             </w:r>
           </w:p>
         </w:tc>
@@ -3521,7 +3560,7 @@
                 <w:i w:val="0"/>
                 <w:sz w:val="17"/>
               </w:rPr>
-              <w:t>237 runs, matched no-branch control G, MAC-matched Swins, per-arm LR sweep, committed analysis plans.</w:t>
+              <w:t>Hierarchical ViT with top-3 sparse routing of 256 tokens into 32 macro-slots (V-CEO) and cross-scale attention.</w:t>
             </w:r>
           </w:p>
         </w:tc>
@@ -3542,7 +3581,7 @@
                 <w:i w:val="0"/>
                 <w:sz w:val="17"/>
               </w:rPr>
-              <w:t>CIFAR-100 and Tiny-ImageNet (5 to 8 seeds per cell).</w:t>
+              <w:t>CIFAR-100 and Tiny-ImageNet-200, from scratch.</w:t>
             </w:r>
           </w:p>
         </w:tc>
@@ -3563,6 +3602,133 @@
                 <w:i w:val="0"/>
                 <w:sz w:val="17"/>
               </w:rPr>
+              <w:t>Reported 76.05 +/- 0.09% on CIFAR-100 (3 seeds) against 72.14% for a size-matched Swin, and +0.92 over Swin on Tiny-ImageNet.</w:t>
+            </w:r>
+          </w:p>
+        </w:tc>
+        <w:tc>
+          <w:tcPr>
+            <w:tcW w:type="dxa" w:w="3912"/>
+            <w:vAlign w:val="top"/>
+            <w:shd w:val="clear" w:color="auto" w:fill="F5F9FA"/>
+          </w:tcPr>
+          <w:p>
+            <w:pPr>
+              <w:spacing w:after="0" w:before="0"/>
+            </w:pPr>
+            <w:r/>
+            <w:r>
+              <w:rPr>
+                <w:b w:val="0"/>
+                <w:i w:val="0"/>
+                <w:sz w:val="17"/>
+              </w:rPr>
+              <w:t>Single-seed baselines, no capacity-matched control, best-epoch selection on the test split, no mask-level region evaluation, no scale beyond 64x64.</w:t>
+            </w:r>
+          </w:p>
+        </w:tc>
+      </w:tr>
+      <w:tr>
+        <w:trPr>
+          <w:cantSplit w:val="true"/>
+        </w:trPr>
+        <w:tc>
+          <w:tcPr>
+            <w:tcW w:type="dxa" w:w="567"/>
+            <w:vAlign w:val="top"/>
+          </w:tcPr>
+          <w:p>
+            <w:pPr>
+              <w:spacing w:after="0" w:before="0"/>
+            </w:pPr>
+            <w:r/>
+            <w:r>
+              <w:rPr>
+                <w:b w:val="0"/>
+                <w:i w:val="0"/>
+                <w:sz w:val="17"/>
+              </w:rPr>
+              <w:t>25</w:t>
+            </w:r>
+          </w:p>
+        </w:tc>
+        <w:tc>
+          <w:tcPr>
+            <w:tcW w:type="dxa" w:w="2494"/>
+            <w:vAlign w:val="top"/>
+          </w:tcPr>
+          <w:p>
+            <w:pPr>
+              <w:spacing w:after="0" w:before="0"/>
+            </w:pPr>
+            <w:r/>
+            <w:r>
+              <w:rPr>
+                <w:b/>
+                <w:i w:val="0"/>
+                <w:color w:val="0F2A3D"/>
+                <w:sz w:val="17"/>
+              </w:rPr>
+              <w:t>Das, Compute-matched audit (private draft v13, 2026)</w:t>
+            </w:r>
+          </w:p>
+        </w:tc>
+        <w:tc>
+          <w:tcPr>
+            <w:tcW w:type="dxa" w:w="3175"/>
+            <w:vAlign w:val="top"/>
+          </w:tcPr>
+          <w:p>
+            <w:pPr>
+              <w:spacing w:after="0" w:before="0"/>
+            </w:pPr>
+            <w:r/>
+            <w:r>
+              <w:rPr>
+                <w:b w:val="0"/>
+                <w:i w:val="0"/>
+                <w:sz w:val="17"/>
+              </w:rPr>
+              <w:t>237 runs, matched no-branch control G, MAC-matched Swins, per-arm learning-rate sweep, committed analysis plans.</w:t>
+            </w:r>
+          </w:p>
+        </w:tc>
+        <w:tc>
+          <w:tcPr>
+            <w:tcW w:type="dxa" w:w="2041"/>
+            <w:vAlign w:val="top"/>
+          </w:tcPr>
+          <w:p>
+            <w:pPr>
+              <w:spacing w:after="0" w:before="0"/>
+            </w:pPr>
+            <w:r/>
+            <w:r>
+              <w:rPr>
+                <w:b w:val="0"/>
+                <w:i w:val="0"/>
+                <w:sz w:val="17"/>
+              </w:rPr>
+              <w:t>CIFAR-100 and Tiny-ImageNet (5 to 8 seeds per cell).</w:t>
+            </w:r>
+          </w:p>
+        </w:tc>
+        <w:tc>
+          <w:tcPr>
+            <w:tcW w:type="dxa" w:w="2948"/>
+            <w:vAlign w:val="top"/>
+          </w:tcPr>
+          <w:p>
+            <w:pPr>
+              <w:spacing w:after="0" w:before="0"/>
+            </w:pPr>
+            <w:r/>
+            <w:r>
+              <w:rPr>
+                <w:b w:val="0"/>
+                <w:i w:val="0"/>
+                <w:sz w:val="17"/>
+              </w:rPr>
               <w:t>Branch below control at the locked LR; sign at selected LRs depends on rate and data set; no robust advantage over a plain Swin.</w:t>
             </w:r>
           </w:p>
@@ -3571,7 +3737,6 @@
           <w:tcPr>
             <w:tcW w:type="dxa" w:w="3912"/>
             <w:vAlign w:val="top"/>
-            <w:shd w:val="clear" w:color="auto" w:fill="F5F9FA"/>
           </w:tcPr>
           <w:p>
             <w:pPr>
@@ -3786,7 +3951,7 @@
                 <w:i w:val="0"/>
                 <w:sz w:val="19"/>
               </w:rPr>
-              <w:t>Registers (Darcet et al.) show extra input-independent tokens alone help; none of ToMe, DynamicViT, Token Pooling, TokenLearner or PatchMerger tests grouping against such a control.</w:t>
+              <w:t>Register work (entries 10 to 13, 16) shows that extra input-independent tokens change ViT behaviour; the token-merging and tokenizer papers (1 to 9) do not test learned grouping against such a control.</w:t>
             </w:r>
           </w:p>
         </w:tc>
@@ -3852,7 +4017,7 @@
                 <w:i w:val="0"/>
                 <w:sz w:val="19"/>
               </w:rPr>
-              <w:t>Token-reduction work targets inference on pretrained backbones</w:t>
+              <w:t>Merging and pruning are framed as efficiency</w:t>
             </w:r>
           </w:p>
         </w:tc>
@@ -3872,7 +4037,7 @@
                 <w:i w:val="0"/>
                 <w:sz w:val="19"/>
               </w:rPr>
-              <w:t>ToMe, DynamicViT and Token Pooling are not representation components trained from scratch in the small-image regime.</w:t>
+              <w:t>Entries 1 to 5 are inference-time or plug-in methods on existing ViTs; none studies grouping as a from-scratch representation component in the small-image regime.</w:t>
             </w:r>
           </w:p>
         </w:tc>
@@ -3960,7 +4125,7 @@
                 <w:i w:val="0"/>
                 <w:sz w:val="19"/>
               </w:rPr>
-              <w:t>Slot Attention (iterative), GroupViT (image-text) and DINOSAUR (pretrained features) bracket the design space, but a feed-forward top-k assignment trained from class labels is not characterised.</w:t>
+              <w:t>Slot-based work (14 to 16) relies on reconstruction, frozen foundation-model targets or diffusion decoders; a feed-forward top-k assignment trained from class labels is uncharacterised.</w:t>
             </w:r>
           </w:p>
         </w:tc>
@@ -4026,7 +4191,7 @@
                 <w:i w:val="0"/>
                 <w:sz w:val="19"/>
               </w:rPr>
-              <w:t>Weak evaluation protocols in this literature</w:t>
+              <w:t>Evaluation protocols are weak</w:t>
             </w:r>
           </w:p>
         </w:tc>
@@ -4046,7 +4211,7 @@
                 <w:i w:val="0"/>
                 <w:sz w:val="19"/>
               </w:rPr>
-              <w:t>Steiner, Wightman, Lucic, Musgrave and Bouthillier show recipe, tuning and seed variance can reverse rankings; our own baselines were single-seed with test-split selection.</w:t>
+              <w:t>Entries 19 to 21 show that under-tuned baselines and weak evaluation inflate claimed gains; our own baselines were single-seed with test-split selection (entry 24).</w:t>
             </w:r>
           </w:p>
         </w:tc>
@@ -4113,7 +4278,7 @@
                 <w:i w:val="0"/>
                 <w:sz w:val="19"/>
               </w:rPr>
-              <w:t>Emergent-region claims are qualitative</w:t>
+              <w:t>Region claims are qualitative and protocol-sensitive</w:t>
             </w:r>
           </w:p>
         </w:tc>
@@ -4134,7 +4299,7 @@
                 <w:i w:val="0"/>
                 <w:sz w:val="19"/>
               </w:rPr>
-              <w:t>DINO and our Fig. 5 show attention or slot maps visually; ImageNet-S gives a mask protocol that has not been applied to routing-based hierarchies.</w:t>
+              <w:t>Entries 17 and 18 show that localisation from ViT attention is noisy and depends on extraction; our region figures were visual only.</w:t>
             </w:r>
           </w:p>
         </w:tc>
@@ -4220,7 +4385,7 @@
                 <w:i w:val="0"/>
                 <w:sz w:val="19"/>
               </w:rPr>
-              <w:t>The advantage over Swin narrowed by 76% from 32x32 to 64x64 in the minor project; behaviour at ImageNet-like resolution is unknown.</w:t>
+              <w:t>The advantage over Swin narrowed by 76% from 32x32 to 64x64 in the minor project; small-data hierarchical ViTs (entry 9) lean on hand-designed locality priors, and ImageNet-like scale is unknown.</w:t>
             </w:r>
           </w:p>
         </w:tc>
@@ -4278,7 +4443,7 @@
         <w:rPr>
           <w:sz w:val="18"/>
         </w:rPr>
-        <w:t>A. Dosovitskiy et al., "An image is worth 16x16 words: Transformers for image recognition at scale," in Proc. ICLR, 2021.</w:t>
+        <w:t>D.-J. Lee, J. Hur, J. Choi, J. Yu and J. Kim, "Frequency-aware token reduction for efficient vision transformer," in Proc. NeurIPS, 2025.</w:t>
       </w:r>
     </w:p>
     <w:p>
@@ -4297,7 +4462,7 @@
         <w:rPr>
           <w:sz w:val="18"/>
         </w:rPr>
-        <w:t>Z. Liu et al., "Swin Transformer: Hierarchical vision transformer using shifted windows," in Proc. IEEE/CVF ICCV, 2021, pp. 10012-10022.</w:t>
+        <w:t>W. Xie, X. Chen, X. Zhang, C. Hao, J. Ma, Y. Li and L. Fang, "Saliency-driven token merging for vision transformers," in Proc. IEEE/CVF CVPR, 2026.</w:t>
       </w:r>
     </w:p>
     <w:p>
@@ -4316,7 +4481,7 @@
         <w:rPr>
           <w:sz w:val="18"/>
         </w:rPr>
-        <w:t>W. Wang et al., "Pyramid vision transformer: A versatile backbone for dense prediction without convolutions," in Proc. IEEE/CVF ICCV, 2021, pp. 568-578.</w:t>
+        <w:t>Q. Zhou, H. Zhang, T. Yang, J. Gao and Q. Wang, "Statistically calibrated scaling for token merging in transformers," in Proc. ICML, 2026.</w:t>
       </w:r>
     </w:p>
     <w:p>
@@ -4335,7 +4500,7 @@
         <w:rPr>
           <w:sz w:val="18"/>
         </w:rPr>
-        <w:t>Y. Rao et al., "DynamicViT: Efficient vision transformers with dynamic token sparsification," in Proc. NeurIPS, vol. 34, 2021, pp. 13937-13949.</w:t>
+        <w:t>O. Schlesinger, A. Farzam, J. M. Di Martino and G. Sapiro, "SPOT: Sparsification with attention dynamics via token relevance in vision transformers," in Findings of IEEE/CVF CVPR, 2026.</w:t>
       </w:r>
     </w:p>
     <w:p>
@@ -4354,7 +4519,7 @@
         <w:rPr>
           <w:sz w:val="18"/>
         </w:rPr>
-        <w:t>D. Bolya et al., "Token merging: Your ViT but faster," in Proc. ICLR, 2023.</w:t>
+        <w:t>Y. Wang and Y. Yang, "Efficient visual transformer by learnable token merging," IEEE Trans. Pattern Anal. Mach. Intell., vol. 47, no. 11, pp. 9608-9624, 2025, doi:10.1109/TPAMI.2025.3588186.</w:t>
       </w:r>
     </w:p>
     <w:p>
@@ -4373,7 +4538,7 @@
         <w:rPr>
           <w:sz w:val="18"/>
         </w:rPr>
-        <w:t>D. Marin et al., "Token pooling in vision transformers for image classification," in Proc. IEEE/CVF WACV, 2023, pp. 12-21.</w:t>
+        <w:t>Y. Yu, D. Zhao, G. Shen, Y. Dong and Y. Zeng, "Brain-inspired stepwise patch merging for vision transformers," in Proc. IJCAI, 2025, doi:10.24963/ijcai.2025/257.</w:t>
       </w:r>
     </w:p>
     <w:p>
@@ -4392,7 +4557,7 @@
         <w:rPr>
           <w:sz w:val="18"/>
         </w:rPr>
-        <w:t>Y. Wang and Y. Yang, "Efficient visual transformer by learnable token merging," IEEE Trans. Pattern Anal. Mach. Intell., vol. 47, no. 11, pp. 9608-9624, 2025.</w:t>
+        <w:t>S. Yin, K. Yin, Y. Liu, W. Chen and L. Lin, "DART: Differentiable dynamic adaptive region tokenizer for vision transformer and Mamba," arXiv:2506.10390, 2025.</w:t>
       </w:r>
     </w:p>
     <w:p>
@@ -4411,7 +4576,7 @@
         <w:rPr>
           <w:sz w:val="18"/>
         </w:rPr>
-        <w:t>M. S. Ryoo et al., "TokenLearner: What can 8 learned tokens do for images and videos?" in Proc. NeurIPS, 2021, arXiv:2106.11297.</w:t>
+        <w:t>S. Duggal, P. Isola, A. Torralba and W. T. Freeman, "Adaptive length image tokenization via recurrent allocation," in Proc. ICLR, 2025.</w:t>
       </w:r>
     </w:p>
     <w:p>
@@ -4430,7 +4595,7 @@
         <w:rPr>
           <w:sz w:val="18"/>
         </w:rPr>
-        <w:t>C. Renggli et al., "Learning to merge tokens in vision transformers," arXiv:2202.12015, 2022.</w:t>
+        <w:t>P. Khadka, R. Rizk, L. Wang and K. C. Santosh, "CoSwin: Convolution enhanced hierarchical shifted window attention for small-scale vision," arXiv preprint, 2025.</w:t>
       </w:r>
     </w:p>
     <w:p>
@@ -4449,7 +4614,7 @@
         <w:rPr>
           <w:sz w:val="18"/>
         </w:rPr>
-        <w:t>F. Locatello et al., "Object-centric learning with slot attention," in Proc. NeurIPS, vol. 33, 2020, pp. 11525-11538.</w:t>
+        <w:t>N. Jiang, A. Dravid, A. A. Efros and Y. Gandelsman, "Vision transformers don't need trained registers," in Proc. NeurIPS, 2025.</w:t>
       </w:r>
     </w:p>
     <w:p>
@@ -4468,7 +4633,7 @@
         <w:rPr>
           <w:sz w:val="18"/>
         </w:rPr>
-        <w:t>J. Xu et al., "GroupViT: Semantic segmentation emerges from text supervision," in Proc. IEEE/CVF CVPR, 2022, pp. 18134-18144.</w:t>
+        <w:t>Z. Yan, Y. Chen, C. Zhou, B. Dai and A. Luo, "Vision transformers with self-distilled registers," in Proc. NeurIPS, 2025.</w:t>
       </w:r>
     </w:p>
     <w:p>
@@ -4487,7 +4652,7 @@
         <w:rPr>
           <w:sz w:val="18"/>
         </w:rPr>
-        <w:t>M. Seitzer et al., "Bridging the gap to real-world object-centric learning," in Proc. ICLR, 2023.</w:t>
+        <w:t>A. Lappe and M. A. Giese, "Register and [CLS] tokens induce a decoupling of local and global features in large ViTs," in Proc. NeurIPS, 2025.</w:t>
       </w:r>
     </w:p>
     <w:p>
@@ -4506,7 +4671,7 @@
         <w:rPr>
           <w:sz w:val="18"/>
         </w:rPr>
-        <w:t>A. Jaegle et al., "Perceiver: General perception with iterative attention," in Proc. ICML, 2021, pp. 4651-4664.</w:t>
+        <w:t>M. Tang and H. Qi, "The extra tokens matter: Disentangled representation learning with vision transformers," in Proc. ICML, 2026.</w:t>
       </w:r>
     </w:p>
     <w:p>
@@ -4525,7 +4690,7 @@
         <w:rPr>
           <w:sz w:val="18"/>
         </w:rPr>
-        <w:t>T. Darcet et al., "Vision transformers need registers," in Proc. ICLR, 2024.</w:t>
+        <w:t>N. Dukic, T. Lebailly and T. Tuytelaars, "Object-centric pretraining via target encoder bootstrapping," in Proc. ICLR, 2025.</w:t>
       </w:r>
     </w:p>
     <w:p>
@@ -4544,7 +4709,7 @@
         <w:rPr>
           <w:sz w:val="18"/>
         </w:rPr>
-        <w:t>M. Caron et al., "Emerging properties in self-supervised vision transformers," in Proc. IEEE/CVF ICCV, 2021, pp. 9650-9660.</w:t>
+        <w:t>K. Singh, S. Schaub-Meyer and S. Roth, "GLASS: Guided latent slot diffusion for object-centric learning," in Proc. IEEE/CVF CVPR, 2025.</w:t>
       </w:r>
     </w:p>
     <w:p>
@@ -4563,7 +4728,7 @@
         <w:rPr>
           <w:sz w:val="18"/>
         </w:rPr>
-        <w:t>S. Gao et al., "Large-scale unsupervised semantic segmentation," IEEE Trans. Pattern Anal. Mach. Intell., 2023, doi:10.1109/TPAMI.2022.3218275.</w:t>
+        <w:t>A. K. Akan, "Learning object-centric representations based on slots in real world scenarios," arXiv:2509.24652, 2025.</w:t>
       </w:r>
     </w:p>
     <w:p>
@@ -4582,7 +4747,7 @@
         <w:rPr>
           <w:sz w:val="18"/>
         </w:rPr>
-        <w:t>E. P. Hoel, L. Albantakis and G. Tononi, "Quantifying causal emergence shows that macro can beat micro," Proc. Natl. Acad. Sci., vol. 110, no. 49, pp. 19790-19795, 2013.</w:t>
+        <w:t>O. Simeoni et al., "DINOv3," arXiv:2508.10104, 2025.</w:t>
       </w:r>
     </w:p>
     <w:p>
@@ -4601,7 +4766,7 @@
         <w:rPr>
           <w:sz w:val="18"/>
         </w:rPr>
-        <w:t>A. Steiner et al., "How to train your ViT? Data, augmentation, and regularization in vision transformers," Trans. Mach. Learn. Res., 2022.</w:t>
+        <w:t>S. Rawlekar, A. Swain, Y. Cai, Y. Wang, M.-H. Yang and N. Ahuja, "Finding distributed object-centric properties in self-supervised transformers," in Proc. IEEE/CVF CVPR, 2026.</w:t>
       </w:r>
     </w:p>
     <w:p>
@@ -4620,7 +4785,7 @@
         <w:rPr>
           <w:sz w:val="18"/>
         </w:rPr>
-        <w:t>R. Wightman, H. Touvron and H. Jegou, "ResNet strikes back: An improved training procedure in timm," arXiv:2110.00476, 2021.</w:t>
+        <w:t>K. Wen, D. L. W. Hall, T. Ma and P. Liang, "Fantastic pretraining optimizers and where to find them," in Proc. ICLR, 2026.</w:t>
       </w:r>
     </w:p>
     <w:p>
@@ -4639,7 +4804,7 @@
         <w:rPr>
           <w:sz w:val="18"/>
         </w:rPr>
-        <w:t>M. Lucic et al., "Are GANs created equal? A large-scale study," in Proc. NeurIPS, 2018.</w:t>
+        <w:t>P. Kasimbeg, V. Roulet, N. Agarwal, S. Medapati, F. Pedregosa, A. Agarwala and G. E. Dahl, "How far away are truly hyperparameter-free learning algorithms?" Trans. Mach. Learn. Res., 2025.</w:t>
       </w:r>
     </w:p>
     <w:p>
@@ -4658,7 +4823,7 @@
         <w:rPr>
           <w:sz w:val="18"/>
         </w:rPr>
-        <w:t>K. Musgrave, S. Belongie and S.-N. Lim, "A metric learning reality check," in Proc. ECCV, 2020.</w:t>
+        <w:t>A. Hochlehnert, H. Bhatnagar, V. Udandarao, S. Albanie, A. Prabhu and M. Bethge, "A sober look at progress in language model reasoning: Pitfalls and paths to reproducibility," in Proc. COLM, 2025.</w:t>
       </w:r>
     </w:p>
     <w:p>
@@ -4677,7 +4842,7 @@
         <w:rPr>
           <w:sz w:val="18"/>
         </w:rPr>
-        <w:t>X. Bouthillier et al., "Accounting for variance in machine learning benchmarks," in Proc. MLSys, 2021.</w:t>
+        <w:t>E. Hoel, "Causal emergence 2.0: Quantifying emergent complexity," arXiv:2503.13395, 2025.</w:t>
       </w:r>
     </w:p>
     <w:p>
@@ -4696,7 +4861,7 @@
         <w:rPr>
           <w:sz w:val="18"/>
         </w:rPr>
-        <w:t>D. J. Das, R. Sharma and E. M, "CET-ViT: Causal Emergence Transformer for Vision," in Proc. ICSL-DSGA, IEEE, 2026, doi:10.1109/ICSL-DSGA70378.2026.11736840.</w:t>
+        <w:t>J. Zhang, R. Tao, K. H. Leong, M. Yang and B. Yuan, "Dynamical reversibility and a new theory of causal emergence based on SVD," npj Complexity, vol. 2, no. 1, p. 3, 2025.</w:t>
       </w:r>
     </w:p>
     <w:p>
@@ -4715,7 +4880,76 @@
         <w:rPr>
           <w:sz w:val="18"/>
         </w:rPr>
+        <w:t>D. J. Das, R. Sharma and E. M, "CET-ViT: Causal Emergence Transformer for Vision," in Proc. ICSL-DSGA, IEEE, 2026, doi:10.1109/ICSL-DSGA70378.2026.11736840.</w:t>
+      </w:r>
+    </w:p>
+    <w:p>
+      <w:pPr>
+        <w:spacing w:after="60"/>
+        <w:ind w:left="510" w:hanging="510"/>
+      </w:pPr>
+      <w:r>
+        <w:rPr>
+          <w:b/>
+          <w:sz w:val="18"/>
+        </w:rPr>
+        <w:t xml:space="preserve">[25]  </w:t>
+      </w:r>
+      <w:r>
+        <w:rPr>
+          <w:sz w:val="18"/>
+        </w:rPr>
         <w:t>D. J. Das, "A learned grouping branch versus a compute-matched control: the answer depends on the learning rate," unpublished manuscript (draft v13), 2026.</w:t>
+      </w:r>
+    </w:p>
+    <w:p>
+      <w:pPr>
+        <w:spacing w:before="120" w:after="60"/>
+      </w:pPr>
+      <w:r>
+        <w:rPr>
+          <w:b/>
+          <w:sz w:val="18"/>
+        </w:rPr>
+        <w:t>Background works (before 2025), cited in the text only:</w:t>
+      </w:r>
+    </w:p>
+    <w:p>
+      <w:pPr>
+        <w:spacing w:after="60"/>
+        <w:ind w:left="510" w:hanging="510"/>
+      </w:pPr>
+      <w:r>
+        <w:rPr>
+          <w:b/>
+          <w:sz w:val="18"/>
+        </w:rPr>
+        <w:t xml:space="preserve">[B1]  </w:t>
+      </w:r>
+      <w:r>
+        <w:rPr>
+          <w:sz w:val="18"/>
+        </w:rPr>
+        <w:t>Z. Liu et al., "Swin Transformer: Hierarchical vision transformer using shifted windows," in Proc. IEEE/CVF ICCV, 2021, pp. 10012-10022.</w:t>
+      </w:r>
+    </w:p>
+    <w:p>
+      <w:pPr>
+        <w:spacing w:after="60"/>
+        <w:ind w:left="510" w:hanging="510"/>
+      </w:pPr>
+      <w:r>
+        <w:rPr>
+          <w:b/>
+          <w:sz w:val="18"/>
+        </w:rPr>
+        <w:t xml:space="preserve">[B2]  </w:t>
+      </w:r>
+      <w:r>
+        <w:rPr>
+          <w:sz w:val="18"/>
+        </w:rPr>
+        <w:t>W. Wang et al., "Pyramid vision transformer: A versatile backbone for dense prediction without convolutions," in Proc. IEEE/CVF ICCV, 2021, pp. 568-578.</w:t>
       </w:r>
     </w:p>
     <w:sectPr>

</xml_diff>